<commit_message>
Class Model Validation & Review (#204)
</commit_message>
<xml_diff>
--- a/Class Specification Document.docx
+++ b/Class Specification Document.docx
@@ -17,6 +17,21 @@
         </w:rPr>
         <w:t>Class Specification Document</w:t>
       </w:r>
+      <w:r>
+        <w:rPr>
+          <w:rFonts w:eastAsiaTheme="minorHAnsi"/>
+        </w:rPr>
+        <w:t xml:space="preserve"> </w:t>
+      </w:r>
+      <w:r>
+        <w:rPr>
+          <w:rFonts w:eastAsiaTheme="minorHAnsi"/>
+          <w:color w:val="D9D9D9" w:themeColor="background1" w:themeShade="D9"/>
+          <w:sz w:val="24"/>
+          <w:szCs w:val="32"/>
+        </w:rPr>
+        <w:t>(Reviewed)</w:t>
+      </w:r>
     </w:p>
     <w:p>
       <w:pPr>
@@ -31,7 +46,15 @@
         <w:spacing w:line="278" w:lineRule="auto"/>
       </w:pPr>
       <w:r>
-        <w:t>This document contains a detailed specification of classes identified during the analysis and design phase for the KriGo system. The class model represents the static structure of the system, and describes the entities, attributes, operations and relationships needed to support customers, rental agencies, administrators, financial management, notifications, reservations, and mobile applications.</w:t>
+        <w:t xml:space="preserve">This document contains a detailed specification of classes identified during the analysis and design phase for the </w:t>
+      </w:r>
+      <w:proofErr w:type="spellStart"/>
+      <w:r>
+        <w:t>KriGo</w:t>
+      </w:r>
+      <w:proofErr w:type="spellEnd"/>
+      <w:r>
+        <w:t xml:space="preserve"> system. The class model represents the static structure of the system, and describes the entities, attributes, operations and relationships needed to support customers, rental agencies, administrators, financial management, notifications, reservations, and mobile applications.</w:t>
       </w:r>
     </w:p>
     <w:p>
@@ -1543,7 +1566,23 @@
         <w:t xml:space="preserve"> </w:t>
       </w:r>
       <w:r>
-        <w:t>Admin and Employee relationships. Managing subscriptions, financial records and agency verification documents. The diagram also leverages external services like MapsService and AIAnalyticsService to assist in location management and business analytics.</w:t>
+        <w:t xml:space="preserve">Admin and Employee relationships. Managing subscriptions, financial records and agency verification documents. The diagram also leverages external services like </w:t>
+      </w:r>
+      <w:proofErr w:type="spellStart"/>
+      <w:r>
+        <w:t>MapsService</w:t>
+      </w:r>
+      <w:proofErr w:type="spellEnd"/>
+      <w:r>
+        <w:t xml:space="preserve"> and </w:t>
+      </w:r>
+      <w:proofErr w:type="spellStart"/>
+      <w:r>
+        <w:t>AIAnalyticsService</w:t>
+      </w:r>
+      <w:proofErr w:type="spellEnd"/>
+      <w:r>
+        <w:t xml:space="preserve"> to assist in location management and business analytics.</w:t>
       </w:r>
     </w:p>
     <w:p>
@@ -1891,24 +1930,14 @@
                             <w:r>
                               <w:t xml:space="preserve">Figure </w:t>
                             </w:r>
-                            <w:r>
-                              <w:fldChar w:fldCharType="begin"/>
-                            </w:r>
-                            <w:r>
-                              <w:instrText xml:space="preserve"> SEQ Figure \* ARABIC </w:instrText>
-                            </w:r>
-                            <w:r>
-                              <w:fldChar w:fldCharType="separate"/>
-                            </w:r>
-                            <w:r>
-                              <w:rPr>
-                                <w:noProof/>
-                              </w:rPr>
-                              <w:t>5</w:t>
-                            </w:r>
-                            <w:r>
-                              <w:fldChar w:fldCharType="end"/>
-                            </w:r>
+                            <w:fldSimple w:instr=" SEQ Figure \* ARABIC ">
+                              <w:r>
+                                <w:rPr>
+                                  <w:noProof/>
+                                </w:rPr>
+                                <w:t>5</w:t>
+                              </w:r>
+                            </w:fldSimple>
                             <w:r>
                               <w:t xml:space="preserve"> </w:t>
                             </w:r>
@@ -1948,24 +1977,14 @@
                       <w:r>
                         <w:t xml:space="preserve">Figure </w:t>
                       </w:r>
-                      <w:r>
-                        <w:fldChar w:fldCharType="begin"/>
-                      </w:r>
-                      <w:r>
-                        <w:instrText xml:space="preserve"> SEQ Figure \* ARABIC </w:instrText>
-                      </w:r>
-                      <w:r>
-                        <w:fldChar w:fldCharType="separate"/>
-                      </w:r>
-                      <w:r>
-                        <w:rPr>
-                          <w:noProof/>
-                        </w:rPr>
-                        <w:t>5</w:t>
-                      </w:r>
-                      <w:r>
-                        <w:fldChar w:fldCharType="end"/>
-                      </w:r>
+                      <w:fldSimple w:instr=" SEQ Figure \* ARABIC ">
+                        <w:r>
+                          <w:rPr>
+                            <w:noProof/>
+                          </w:rPr>
+                          <w:t>5</w:t>
+                        </w:r>
+                      </w:fldSimple>
                       <w:r>
                         <w:t xml:space="preserve"> </w:t>
                       </w:r>
@@ -2431,24 +2450,14 @@
                             <w:r>
                               <w:t xml:space="preserve">Figure </w:t>
                             </w:r>
-                            <w:r>
-                              <w:fldChar w:fldCharType="begin"/>
-                            </w:r>
-                            <w:r>
-                              <w:instrText xml:space="preserve"> SEQ Figure \* ARABIC </w:instrText>
-                            </w:r>
-                            <w:r>
-                              <w:fldChar w:fldCharType="separate"/>
-                            </w:r>
-                            <w:r>
-                              <w:rPr>
-                                <w:noProof/>
-                              </w:rPr>
-                              <w:t>6</w:t>
-                            </w:r>
-                            <w:r>
-                              <w:fldChar w:fldCharType="end"/>
-                            </w:r>
+                            <w:fldSimple w:instr=" SEQ Figure \* ARABIC ">
+                              <w:r>
+                                <w:rPr>
+                                  <w:noProof/>
+                                </w:rPr>
+                                <w:t>6</w:t>
+                              </w:r>
+                            </w:fldSimple>
                             <w:r>
                               <w:t xml:space="preserve"> - </w:t>
                             </w:r>
@@ -2485,24 +2494,14 @@
                       <w:r>
                         <w:t xml:space="preserve">Figure </w:t>
                       </w:r>
-                      <w:r>
-                        <w:fldChar w:fldCharType="begin"/>
-                      </w:r>
-                      <w:r>
-                        <w:instrText xml:space="preserve"> SEQ Figure \* ARABIC </w:instrText>
-                      </w:r>
-                      <w:r>
-                        <w:fldChar w:fldCharType="separate"/>
-                      </w:r>
-                      <w:r>
-                        <w:rPr>
-                          <w:noProof/>
-                        </w:rPr>
-                        <w:t>6</w:t>
-                      </w:r>
-                      <w:r>
-                        <w:fldChar w:fldCharType="end"/>
-                      </w:r>
+                      <w:fldSimple w:instr=" SEQ Figure \* ARABIC ">
+                        <w:r>
+                          <w:rPr>
+                            <w:noProof/>
+                          </w:rPr>
+                          <w:t>6</w:t>
+                        </w:r>
+                      </w:fldSimple>
                       <w:r>
                         <w:t xml:space="preserve"> - </w:t>
                       </w:r>
@@ -2580,32 +2579,110 @@
         </w:drawing>
       </w:r>
       <w:r>
-        <w:t>The class diagram of Mobile Application models the architecture of mobile client of the car rental system. It takes care of user authentication, local storage, device permissions, and push notifications. It describes the associations between the classes MobileApp, UserSession, Device, Notification, and Permission. To enable communication , synchronization , and mobile - specific features , the diagram also includes external interfaces , Api</w:t>
-      </w:r>
+        <w:t xml:space="preserve">The class diagram of Mobile Application models the architecture of mobile client of the car rental system. It takes care of user authentication, local storage, device permissions, and push notifications. It describes the associations between the classes </w:t>
+      </w:r>
+      <w:proofErr w:type="spellStart"/>
+      <w:r>
+        <w:t>MobileApp</w:t>
+      </w:r>
+      <w:proofErr w:type="spellEnd"/>
+      <w:r>
+        <w:t xml:space="preserve">, </w:t>
+      </w:r>
+      <w:proofErr w:type="spellStart"/>
+      <w:r>
+        <w:t>UserSession</w:t>
+      </w:r>
+      <w:proofErr w:type="spellEnd"/>
+      <w:r>
+        <w:t xml:space="preserve">, Device, Notification, and Permission. To enable </w:t>
+      </w:r>
+      <w:proofErr w:type="gramStart"/>
+      <w:r>
+        <w:t>communication ,</w:t>
+      </w:r>
+      <w:proofErr w:type="gramEnd"/>
       <w:r>
         <w:t xml:space="preserve"> </w:t>
       </w:r>
-      <w:r>
-        <w:t>Client , Sync</w:t>
+      <w:proofErr w:type="gramStart"/>
+      <w:r>
+        <w:t>synchronization ,</w:t>
+      </w:r>
+      <w:proofErr w:type="gramEnd"/>
+      <w:r>
+        <w:t xml:space="preserve"> and mobile - specific </w:t>
+      </w:r>
+      <w:proofErr w:type="gramStart"/>
+      <w:r>
+        <w:t>features ,</w:t>
+      </w:r>
+      <w:proofErr w:type="gramEnd"/>
+      <w:r>
+        <w:t xml:space="preserve"> the diagram also includes external </w:t>
+      </w:r>
+      <w:proofErr w:type="gramStart"/>
+      <w:r>
+        <w:t>interfaces ,</w:t>
+      </w:r>
+      <w:proofErr w:type="gramEnd"/>
+      <w:r>
+        <w:t xml:space="preserve"> Api</w:t>
       </w:r>
       <w:r>
         <w:t xml:space="preserve"> </w:t>
       </w:r>
-      <w:r>
-        <w:t>Service , MapsService , Notification</w:t>
+      <w:proofErr w:type="gramStart"/>
+      <w:r>
+        <w:t>Client ,</w:t>
+      </w:r>
+      <w:proofErr w:type="gramEnd"/>
+      <w:r>
+        <w:t xml:space="preserve"> Sync</w:t>
       </w:r>
       <w:r>
         <w:t xml:space="preserve"> </w:t>
       </w:r>
-      <w:r>
-        <w:t>Service , and Local</w:t>
-      </w:r>
+      <w:proofErr w:type="gramStart"/>
+      <w:r>
+        <w:t>Service ,</w:t>
+      </w:r>
+      <w:proofErr w:type="gramEnd"/>
       <w:r>
         <w:t xml:space="preserve"> </w:t>
       </w:r>
+      <w:proofErr w:type="spellStart"/>
+      <w:proofErr w:type="gramStart"/>
+      <w:r>
+        <w:t>MapsService</w:t>
+      </w:r>
+      <w:proofErr w:type="spellEnd"/>
+      <w:r>
+        <w:t xml:space="preserve"> ,</w:t>
+      </w:r>
+      <w:proofErr w:type="gramEnd"/>
+      <w:r>
+        <w:t xml:space="preserve"> Notification</w:t>
+      </w:r>
+      <w:r>
+        <w:t xml:space="preserve"> </w:t>
+      </w:r>
+      <w:proofErr w:type="gramStart"/>
+      <w:r>
+        <w:t>Service ,</w:t>
+      </w:r>
+      <w:proofErr w:type="gramEnd"/>
+      <w:r>
+        <w:t xml:space="preserve"> and Local</w:t>
+      </w:r>
+      <w:r>
+        <w:t xml:space="preserve"> </w:t>
+      </w:r>
+      <w:proofErr w:type="gramStart"/>
       <w:r>
         <w:t>Storage .</w:t>
       </w:r>
+      <w:proofErr w:type="gramEnd"/>
     </w:p>
     <w:p>
       <w:pPr>
@@ -2636,6 +2713,7 @@
           <w:bCs/>
         </w:rPr>
       </w:pPr>
+      <w:proofErr w:type="spellStart"/>
       <w:r>
         <w:rPr>
           <w:b/>
@@ -2644,6 +2722,7 @@
         <w:lastRenderedPageBreak/>
         <w:t>MobileApp</w:t>
       </w:r>
+      <w:proofErr w:type="spellEnd"/>
     </w:p>
     <w:p>
       <w:pPr>
@@ -2661,6 +2740,7 @@
           <w:bCs/>
         </w:rPr>
       </w:pPr>
+      <w:proofErr w:type="spellStart"/>
       <w:r>
         <w:rPr>
           <w:b/>
@@ -2668,6 +2748,7 @@
         </w:rPr>
         <w:t>UserSession</w:t>
       </w:r>
+      <w:proofErr w:type="spellEnd"/>
     </w:p>
     <w:p>
       <w:pPr>
@@ -2880,7 +2961,15 @@
         <w:spacing w:line="278" w:lineRule="auto"/>
       </w:pPr>
       <w:r>
-        <w:t>provides analytical and predictive insights about the agency’s or administrator’s operations and/or administrative issues based on operational and financial metrics and data collected. This class will provide reports, identify trends, and help users access and use the data they need to make decisions.</w:t>
+        <w:t xml:space="preserve">provides analytical and predictive insights about the </w:t>
+      </w:r>
+      <w:proofErr w:type="gramStart"/>
+      <w:r>
+        <w:t>agency’s</w:t>
+      </w:r>
+      <w:proofErr w:type="gramEnd"/>
+      <w:r>
+        <w:t xml:space="preserve"> or administrator’s operations and/or administrative issues based on operational and financial metrics and data collected. This class will provide reports, identify trends, and help users access and use the data they need to make decisions.</w:t>
       </w:r>
     </w:p>
     <w:p>
@@ -3185,7 +3274,15 @@
         </w:rPr>
       </w:pPr>
       <w:r>
-        <w:t>The Class Specification Document includes specification of the KriGo smart car rental platform showing classes’ attributes and operations, relations between the classes and their responsibilities. The customer and rental manager class specifies how customers can register and login to the platform, search and book rentals, manage bookings and make online payments. Rental agency class specifies how agency managers can create and manage rental agencies on the platform. Administration and financial manager class specifies how administrators can manage the platform resources and users, process users’ rental requests and refunds, perform administrative tasks like generating reports and statistics on system usage, etc. Mobile services manager class specifies functionalities related to supporting mobile applications in the platform and AI and external services manager class specifies integration with external services as well as artificial intelligence components.</w:t>
+        <w:t xml:space="preserve">The Class Specification Document includes specification of the </w:t>
+      </w:r>
+      <w:proofErr w:type="spellStart"/>
+      <w:r>
+        <w:t>KriGo</w:t>
+      </w:r>
+      <w:proofErr w:type="spellEnd"/>
+      <w:r>
+        <w:t xml:space="preserve"> smart car rental platform showing classes’ attributes and operations, relations between the classes and their responsibilities. The customer and rental manager class specifies how customers can register and login to the platform, search and book rentals, manage bookings and make online payments. Rental agency class specifies how agency managers can create and manage rental agencies on the platform. Administration and financial manager class specifies how administrators can manage the platform resources and users, process users’ rental requests and refunds, perform administrative tasks like generating reports and statistics on system usage, etc. Mobile services manager class specifies functionalities related to supporting mobile applications in the platform and AI and external services manager class specifies integration with external services as well as artificial intelligence components.</w:t>
       </w:r>
       <w:r>
         <w:br/>
@@ -12148,6 +12245,7 @@
   <w:style w:type="character" w:default="1" w:styleId="DefaultParagraphFont">
     <w:name w:val="Default Paragraph Font"/>
     <w:uiPriority w:val="1"/>
+    <w:semiHidden/>
     <w:unhideWhenUsed/>
   </w:style>
   <w:style w:type="table" w:default="1" w:styleId="TableNormal">

</xml_diff>